<commit_message>
chore: ignore Office temporary lock files and update resume asset
</commit_message>
<xml_diff>
--- a/public/resume.docx
+++ b/public/resume.docx
@@ -64,28 +64,16 @@
           <w:color w:val="222222"/>
           <w:szCs w:val="20"/>
         </w:rPr>
-        <w:t>India | +</w:t>
+        <w:t xml:space="preserve">India </w:t>
       </w:r>
+      <w:bookmarkStart w:id="0" w:name="_GoBack"/>
+      <w:bookmarkEnd w:id="0"/>
       <w:r>
         <w:rPr>
           <w:color w:val="222222"/>
           <w:szCs w:val="20"/>
         </w:rPr>
-        <w:t>91-</w:t>
-      </w:r>
-      <w:r>
-        <w:rPr>
-          <w:color w:val="222222"/>
-          <w:szCs w:val="20"/>
-        </w:rPr>
-        <w:t>9035604326</w:t>
-      </w:r>
-      <w:r>
-        <w:rPr>
-          <w:color w:val="222222"/>
-          <w:szCs w:val="20"/>
-        </w:rPr>
-        <w:t xml:space="preserve"> | hai</w:t>
+        <w:t>| hai</w:t>
       </w:r>
       <w:r>
         <w:rPr>
@@ -115,8 +103,6 @@
         </w:rPr>
         <w:t>.com</w:t>
       </w:r>
-      <w:bookmarkStart w:id="0" w:name="_GoBack"/>
-      <w:bookmarkEnd w:id="0"/>
     </w:p>
     <w:p>
       <w:pPr>
@@ -13361,7 +13347,7 @@
 </file>
 
 <file path=customXml/itemProps1.xml><?xml version="1.0" encoding="utf-8"?>
-<ds:datastoreItem xmlns:ds="http://schemas.openxmlformats.org/officeDocument/2006/customXml" ds:itemID="{49FDDDA0-CEB9-9E45-B3E5-B8E1AFFC927A}">
+<ds:datastoreItem xmlns:ds="http://schemas.openxmlformats.org/officeDocument/2006/customXml" ds:itemID="{692FF10F-44AF-4947-A0A7-E9383C903FAF}">
   <ds:schemaRefs>
     <ds:schemaRef ds:uri="http://schemas.openxmlformats.org/officeDocument/2006/bibliography"/>
   </ds:schemaRefs>

</xml_diff>